<commit_message>
docs: move slide 5 to Vinh, balance speaking time, ignore Office temp files (#17)
</commit_message>
<xml_diff>
--- a/docs/presentation/Project_Presentation_Contribution_Document_G03.docx
+++ b/docs/presentation/Project_Presentation_Contribution_Document_G03.docx
@@ -508,7 +508,7 @@
               <w:rPr>
                 <w:sz w:val="21"/>
               </w:rPr>
-              <w:t>2</w:t>
+              <w:t>2.5</w:t>
             </w:r>
           </w:p>
         </w:tc>
@@ -1050,7 +1050,7 @@
                 <w:b/>
                 <w:sz w:val="21"/>
               </w:rPr>
-              <w:t>9</w:t>
+              <w:t>9.5</w:t>
             </w:r>
           </w:p>
         </w:tc>
@@ -1112,7 +1112,7 @@
         <w:t xml:space="preserve">Ha Minh Nguyen (105304697), App Developer: </w:t>
       </w:r>
       <w:r>
-        <w:t>I planned the presentation structure and the speaker split, mapped the five required topics onto the template's slides, and drafted the full deck on the Swinburne template, including the architecture diagram, the targets-versus-actual table and the pipeline run timeline. I wrote the script and speaker notes for every slide, with each member refining their own section. I presented the introduction, background, scope and objectives, drove the application part of the demo (live site, version footer, short link and statistics page), chaired the Q&amp;A and prepared the contribution document.</w:t>
+        <w:t>I planned the presentation structure and the speaker split, mapped the five required topics onto the template's slides, and drafted the full deck on the Swinburne template, including the architecture diagram, the targets-versus-actual table and the pipeline run timeline. I wrote the script and speaker notes for every slide, with each member refining their own section. I presented the introduction, the overview and the background and problem statement, drove the application part of the demo (live site, version footer, short link and statistics page), chaired the Q&amp;A and prepared the contribution document.</w:t>
       </w:r>
     </w:p>
     <w:p>
@@ -1128,7 +1128,7 @@
         <w:t xml:space="preserve">Vinh Nghiem (105282913), Test and QA: </w:t>
       </w:r>
       <w:r>
-        <w:t>I owned the execution and technical challenges slide. I collected the four problems from our pull request reviews, CI logs and issues, checked each description against the code and the fix that was merged, and wrote the script for that section. I supplied the test figures used on the outcomes slide (unit coverage, integration and end-to-end test counts) and the Playwright evidence, reviewed the deck pull request, and prepared the questions we asked other groups about their testing.</w:t>
+        <w:t>I presented the scope and objectives slide (the application, the four environments, the automation boundary and the targets from our brief) and owned the execution and technical challenges slide. I collected the four problems from our pull request reviews, CI logs and issues, checked each description against the code and the fix that was merged, and wrote the script for that section. I supplied the test figures used on the outcomes slide (unit coverage, integration and end-to-end test counts) and the Playwright evidence, reviewed the deck pull request, and prepared the questions we asked other groups about their testing.</w:t>
       </w:r>
     </w:p>
     <w:p>

</xml_diff>